<commit_message>
docs: bring the manual, both workbooks and the READMEs to the final v1.90 battery-run rules
Co-authored-by: arena-agent <297053741+arena-agent@users.noreply.github.com>
</commit_message>
<xml_diff>
--- a/Documentation/User_Manual.docx
+++ b/Documentation/User_Manual.docx
@@ -1334,6 +1334,78 @@
                 <w:rFonts w:ascii="Vazirmatn" w:hAnsi="Vazirmatn" w:cs="Vazirmatn"/>
                 <w:rtl w:val="1"/>
               </w:rPr>
+              <w:t>هر سه چراغ و بوق خاموش (برق ورودی قطع است)</w:t>
+            </w:r>
+          </w:p>
+        </w:tc>
+        <w:tc>
+          <w:tcPr>
+            <w:tcW w:type="dxa" w:w="3515"/>
+          </w:tcPr>
+          <w:p>
+            <w:pPr>
+              <w:bidi w:val="1"/>
+              <w:spacing w:line="300" w:lineRule="auto"/>
+              <w:jc w:val="right"/>
+            </w:pPr>
+            <w:r/>
+            <w:r>
+              <w:rPr>
+                <w:rFonts w:ascii="Vazirmatn" w:hAnsi="Vazirmatn"/>
+                <w:b w:val="0"/>
+                <w:sz w:val="22"/>
+                <w:rFonts w:ascii="Vazirmatn" w:hAnsi="Vazirmatn" w:cs="Vazirmatn"/>
+                <w:rtl w:val="1"/>
+              </w:rPr>
+              <w:t>باتری خالی شده و دستگاه برای محافظت از آن خروجی را بسته است.</w:t>
+            </w:r>
+          </w:p>
+        </w:tc>
+        <w:tc>
+          <w:tcPr>
+            <w:tcW w:type="dxa" w:w="3061"/>
+          </w:tcPr>
+          <w:p>
+            <w:pPr>
+              <w:bidi w:val="1"/>
+              <w:spacing w:line="300" w:lineRule="auto"/>
+              <w:jc w:val="right"/>
+            </w:pPr>
+            <w:r/>
+            <w:r>
+              <w:rPr>
+                <w:rFonts w:ascii="Vazirmatn" w:hAnsi="Vazirmatn"/>
+                <w:b w:val="0"/>
+                <w:sz w:val="22"/>
+                <w:rFonts w:ascii="Vazirmatn" w:hAnsi="Vazirmatn" w:cs="Vazirmatn"/>
+                <w:rtl w:val="1"/>
+              </w:rPr>
+              <w:t>برق ورودی را برگردانید؛ دستگاه خودش همه‌چیز را به حالت عادی برمی‌گرداند.</w:t>
+            </w:r>
+          </w:p>
+        </w:tc>
+      </w:tr>
+      <w:tr>
+        <w:tc>
+          <w:tcPr>
+            <w:tcW w:type="dxa" w:w="2494"/>
+            <w:shd w:val="clear" w:fill="F2F6FC"/>
+          </w:tcPr>
+          <w:p>
+            <w:pPr>
+              <w:bidi w:val="1"/>
+              <w:spacing w:line="300" w:lineRule="auto"/>
+              <w:jc w:val="right"/>
+            </w:pPr>
+            <w:r/>
+            <w:r>
+              <w:rPr>
+                <w:rFonts w:ascii="Vazirmatn" w:hAnsi="Vazirmatn"/>
+                <w:b w:val="0"/>
+                <w:sz w:val="22"/>
+                <w:rFonts w:ascii="Vazirmatn" w:hAnsi="Vazirmatn" w:cs="Vazirmatn"/>
+                <w:rtl w:val="1"/>
+              </w:rPr>
               <w:t>قرمز چشمک‌زن + بوق</w:t>
             </w:r>
           </w:p>
@@ -1341,6 +1413,7 @@
         <w:tc>
           <w:tcPr>
             <w:tcW w:type="dxa" w:w="3515"/>
+            <w:shd w:val="clear" w:fill="F2F6FC"/>
           </w:tcPr>
           <w:p>
             <w:pPr>
@@ -1364,6 +1437,7 @@
         <w:tc>
           <w:tcPr>
             <w:tcW w:type="dxa" w:w="3061"/>
+            <w:shd w:val="clear" w:fill="F2F6FC"/>
           </w:tcPr>
           <w:p>
             <w:pPr>
@@ -1389,7 +1463,6 @@
         <w:tc>
           <w:tcPr>
             <w:tcW w:type="dxa" w:w="2494"/>
-            <w:shd w:val="clear" w:fill="F2F6FC"/>
           </w:tcPr>
           <w:p>
             <w:pPr>
@@ -1413,7 +1486,6 @@
         <w:tc>
           <w:tcPr>
             <w:tcW w:type="dxa" w:w="3515"/>
-            <w:shd w:val="clear" w:fill="F2F6FC"/>
           </w:tcPr>
           <w:p>
             <w:pPr>
@@ -1437,7 +1509,6 @@
         <w:tc>
           <w:tcPr>
             <w:tcW w:type="dxa" w:w="3061"/>
-            <w:shd w:val="clear" w:fill="F2F6FC"/>
           </w:tcPr>
           <w:p>
             <w:pPr>
@@ -1463,6 +1534,7 @@
         <w:tc>
           <w:tcPr>
             <w:tcW w:type="dxa" w:w="2494"/>
+            <w:shd w:val="clear" w:fill="F2F6FC"/>
           </w:tcPr>
           <w:p>
             <w:pPr>
@@ -1486,6 +1558,7 @@
         <w:tc>
           <w:tcPr>
             <w:tcW w:type="dxa" w:w="3515"/>
+            <w:shd w:val="clear" w:fill="F2F6FC"/>
           </w:tcPr>
           <w:p>
             <w:pPr>
@@ -1509,6 +1582,7 @@
         <w:tc>
           <w:tcPr>
             <w:tcW w:type="dxa" w:w="3061"/>
+            <w:shd w:val="clear" w:fill="F2F6FC"/>
           </w:tcPr>
           <w:p>
             <w:pPr>
@@ -1731,7 +1805,7 @@
           <w:rFonts w:ascii="Vazirmatn" w:hAnsi="Vazirmatn" w:cs="Vazirmatn"/>
           <w:rtl w:val="1"/>
         </w:rPr>
-        <w:t>چراغ سبز چشمک می‌زند تا بدانید دستگاه دارد با باتری کار می‌کند.</w:t>
+        <w:t>چراغ سبز چشمک می‌زند تا بدانید دستگاه دارد با باتری کار می‌کند. تند و کند شدن چشمک نشان می‌دهد باتری پر است یا دارد خالی می‌شود.</w:t>
       </w:r>
     </w:p>
     <w:p>
@@ -1748,7 +1822,7 @@
           <w:rFonts w:ascii="Vazirmatn" w:hAnsi="Vazirmatn" w:cs="Vazirmatn"/>
           <w:rtl w:val="1"/>
         </w:rPr>
-        <w:t>اگر شارژ باتری خیلی کم شود، اول بوق هشدار می‌دهد. اگر برق باز هم برنگردد، دستگاه خروجی را قطع می‌کند تا باتری خراب نشود.</w:t>
+        <w:t>اگر شارژ باتری خیلی کم شود، اول بوق هشدار می‌دهد. اگر برق باز هم برنگردد و ولتاژ دو باتری روی هم به حدود ۲۱ ولت برسد، دستگاه خروجی را قطع می‌کند تا باتری خراب نشود.</w:t>
       </w:r>
     </w:p>
     <w:p>
@@ -1765,7 +1839,92 @@
           <w:rFonts w:ascii="Vazirmatn" w:hAnsi="Vazirmatn" w:cs="Vazirmatn"/>
           <w:rtl w:val="1"/>
         </w:rPr>
-        <w:t>با برگشتن برق ورودی، دستگاه خودش خروجی را وصل می‌کند و شارژ باتری‌ها را از سر می‌گیرد.</w:t>
+        <w:t>بعد از این قطع، هر سه چراغ و بوق خاموش می‌مانند. این خاموشی یعنی دستگاه منتظر برگشتن برق ورودی است؛ خرابی نیست. تا برق ورودی برنگردد، بار روی باتری نمی‌آید.</w:t>
+      </w:r>
+    </w:p>
+    <w:p>
+      <w:pPr>
+        <w:bidi w:val="1"/>
+        <w:spacing w:after="120" w:line="324" w:lineRule="auto"/>
+        <w:jc w:val="both"/>
+      </w:pPr>
+      <w:r>
+        <w:rPr>
+          <w:rFonts w:ascii="Vazirmatn" w:hAnsi="Vazirmatn"/>
+          <w:b w:val="0"/>
+          <w:sz w:val="24"/>
+          <w:rFonts w:ascii="Vazirmatn" w:hAnsi="Vazirmatn" w:cs="Vazirmatn"/>
+          <w:rtl w:val="1"/>
+        </w:rPr>
+        <w:t>یک استثنا هست و آن هم برای محافظت از باتری است: دستگاه ولتاژ باتری را بی‌بار اندازه می‌گیرد. اگر این ولتاژ از حدود ۲۵ ولت کمتر باشد، یعنی باتری خالی است و دستگاه آن را بدون برق ورودی وصل نمی‌کند، هر چقدر هم که ولتاژش بالا و پایین برود. اگر از حدود ۲۵ ولت بیشتر باشد، یعنی باتری پر است و دستگاه فقط یک بار آن را امتحان می‌کند.</w:t>
+      </w:r>
+    </w:p>
+    <w:p>
+      <w:pPr>
+        <w:bidi w:val="1"/>
+        <w:spacing w:after="120" w:line="324" w:lineRule="auto"/>
+        <w:jc w:val="both"/>
+      </w:pPr>
+      <w:r>
+        <w:rPr>
+          <w:rFonts w:ascii="Vazirmatn" w:hAnsi="Vazirmatn"/>
+          <w:b w:val="0"/>
+          <w:sz w:val="24"/>
+          <w:rFonts w:ascii="Vazirmatn" w:hAnsi="Vazirmatn" w:cs="Vazirmatn"/>
+          <w:rtl w:val="1"/>
+        </w:rPr>
+        <w:t>اگر همان یک بار امتحان هم جواب ندهد و بار دوباره داخل حدود یک دقیقه قطع شود، دستگاه می‌فهمد باتری فرسوده است: چراغ قرمز چشمک می‌زند و بوق می‌زند و مسیر باتری بسته می‌ماند. این چشمک و بوق فقط وقتی است که برق ورودی قطع باشد؛ به محض برگشتن برق ورودی، چراغ‌های شارژ برمی‌گردند و بار از برق ورودی کار می‌کند.</w:t>
+      </w:r>
+    </w:p>
+    <w:p>
+      <w:pPr>
+        <w:bidi w:val="1"/>
+        <w:spacing w:after="120" w:line="324" w:lineRule="auto"/>
+        <w:jc w:val="both"/>
+      </w:pPr>
+      <w:r>
+        <w:rPr>
+          <w:rFonts w:ascii="Vazirmatn" w:hAnsi="Vazirmatn"/>
+          <w:b w:val="0"/>
+          <w:sz w:val="24"/>
+          <w:rFonts w:ascii="Vazirmatn" w:hAnsi="Vazirmatn" w:cs="Vazirmatn"/>
+          <w:rtl w:val="1"/>
+        </w:rPr>
+        <w:t>این هشدار باتری فرسوده خودش پاک می‌شود: اگر ولتاژ باتری ۱۰ دقیقه پشت سر هم بالای حدود ۲۱٫۲ ولت بماند، هشدار می‌رود و دستگاه یک بار دیگر می‌تواند باتری را امتحان کند. در پنل، کارت ۸ هم دکمهٔ «پاک‌کردن حکم» دارد که با آن می‌توانید همین حالا هشدار را پاک کنید.</w:t>
+      </w:r>
+    </w:p>
+    <w:p>
+      <w:pPr>
+        <w:bidi w:val="1"/>
+        <w:spacing w:after="120" w:line="324" w:lineRule="auto"/>
+        <w:jc w:val="both"/>
+      </w:pPr>
+      <w:r>
+        <w:rPr>
+          <w:rFonts w:ascii="Vazirmatn" w:hAnsi="Vazirmatn"/>
+          <w:b w:val="0"/>
+          <w:sz w:val="24"/>
+          <w:rFonts w:ascii="Vazirmatn" w:hAnsi="Vazirmatn" w:cs="Vazirmatn"/>
+          <w:rtl w:val="1"/>
+        </w:rPr>
+        <w:t>اگر در حال کار با باتری، سیم باتری قطع یا شل شود، دستگاه بی‌صدا خروجی را قطع می‌کند و چراغ و بوقی روشن نمی‌کند؛ فقط منتظر برق ورودی می‌ماند.</w:t>
+      </w:r>
+    </w:p>
+    <w:p>
+      <w:pPr>
+        <w:bidi w:val="1"/>
+        <w:spacing w:after="120" w:line="324" w:lineRule="auto"/>
+        <w:jc w:val="both"/>
+      </w:pPr>
+      <w:r>
+        <w:rPr>
+          <w:rFonts w:ascii="Vazirmatn" w:hAnsi="Vazirmatn"/>
+          <w:b w:val="0"/>
+          <w:sz w:val="24"/>
+          <w:rFonts w:ascii="Vazirmatn" w:hAnsi="Vazirmatn" w:cs="Vazirmatn"/>
+          <w:rtl w:val="1"/>
+        </w:rPr>
+        <w:t>با برگشتن برق ورودی، دستگاه اول حدود ۳۰ ثانیه صبر می‌کند تا برق ورودی مطمئن و ثابت شود. اگر باتری دست‌کم حدود ۲۱٫۲ ولت داشته باشد، بعد از آن خروجی را وصل می‌کند و شارژ باتری‌ها را از سر می‌گیرد. اگر باتری کمتر از این باشد، خروجی بسته می‌ماند تا باتری کمی شارژ شود.</w:t>
       </w:r>
     </w:p>
     <w:p>
@@ -1793,7 +1952,35 @@
           <w:rFonts w:ascii="Vazirmatn" w:hAnsi="Vazirmatn" w:cs="Vazirmatn"/>
           <w:rtl w:val="1"/>
         </w:rPr>
-        <w:t>برق ساعت ۱۲ می‌رود و دستگاه روی باتری می‌آید. نیم ساعت بعد شارژ باتری به ۴۰ درصد می‌رسد و بوق هشدار می‌دهد. اگر برق دیر برگردد و ولتاژ دو باتری روی هم به حدود ۲۱ ولت برسد، دستگاه خروجی را قطع می‌کند تا باتری خراب نشود. برق که برگردد، همه‌چیز خودش به حالت عادی برمی‌گردد.</w:t>
+        <w:t>برق ساعت ۱۲ می‌رود و دستگاه روی باتری می‌آید. نیم ساعت بعد شارژ باتری به ۴۰ درصد می‌رسد و بوق هشدار می‌دهد. اگر برق دیر برگردد و ولتاژ دو باتری روی هم به حدود ۲۱ ولت برسد، دستگاه خروجی را قطع می‌کند و چراغ‌ها خاموش می‌شوند. برق که برگردد، دستگاه اول ۳۰ ثانیه صبر می‌کند، بعد خروجی را وصل می‌کند و شارژ را از سر می‌گیرد.</w:t>
+      </w:r>
+    </w:p>
+    <w:p>
+      <w:pPr>
+        <w:bidi w:val="1"/>
+        <w:spacing w:after="120" w:line="324" w:lineRule="auto"/>
+        <w:jc w:val="right"/>
+      </w:pPr>
+      <w:r>
+        <w:rPr>
+          <w:rFonts w:ascii="Vazirmatn" w:hAnsi="Vazirmatn"/>
+          <w:b/>
+          <w:color w:val="1F3864"/>
+          <w:sz w:val="24"/>
+          <w:rFonts w:ascii="Vazirmatn" w:hAnsi="Vazirmatn" w:cs="Vazirmatn"/>
+          <w:rtl w:val="1"/>
+        </w:rPr>
+        <w:t xml:space="preserve">مثال:  </w:t>
+      </w:r>
+      <w:r>
+        <w:rPr>
+          <w:rFonts w:ascii="Vazirmatn" w:hAnsi="Vazirmatn"/>
+          <w:b w:val="0"/>
+          <w:sz w:val="24"/>
+          <w:rFonts w:ascii="Vazirmatn" w:hAnsi="Vazirmatn" w:cs="Vazirmatn"/>
+          <w:rtl w:val="1"/>
+        </w:rPr>
+        <w:t>باتری کهنه‌ای دارید که با بار زود خالی می‌شود ولی بی‌بار ولتاژش بالا می‌رود. دستگاه بی‌بار ولتاژش را می‌بیند: اگر بالای ۲۵ ولت باشد یک بار امتحان می‌کند؛ اگر همان بار هم دوباره خالی شد، چراغ قرمز چشمک می‌زند و بوق می‌زند تا بدانید باتری باید عوض شود. اگر بی‌بار هم زیر ۲۵ ولت باشد، دستگاه اصلاً امتحان نمی‌کند و منتظر برق ورودی می‌ماند.</w:t>
       </w:r>
     </w:p>
     <w:p>
@@ -3304,6 +3491,55 @@
                 <w:rFonts w:ascii="Vazirmatn" w:hAnsi="Vazirmatn" w:cs="Vazirmatn"/>
                 <w:rtl w:val="1"/>
               </w:rPr>
+              <w:t>چراغ‌ها خاموش‌اند و بار با باتری روشن نمی‌شود</w:t>
+            </w:r>
+          </w:p>
+        </w:tc>
+        <w:tc>
+          <w:tcPr>
+            <w:tcW w:type="dxa" w:w="6123"/>
+            <w:shd w:val="clear" w:fill="F2F6FC"/>
+          </w:tcPr>
+          <w:p>
+            <w:pPr>
+              <w:bidi w:val="1"/>
+              <w:spacing w:line="300" w:lineRule="auto"/>
+              <w:jc w:val="right"/>
+            </w:pPr>
+            <w:r/>
+            <w:r>
+              <w:rPr>
+                <w:rFonts w:ascii="Vazirmatn" w:hAnsi="Vazirmatn"/>
+                <w:b w:val="0"/>
+                <w:sz w:val="22"/>
+                <w:rFonts w:ascii="Vazirmatn" w:hAnsi="Vazirmatn" w:cs="Vazirmatn"/>
+                <w:rtl w:val="1"/>
+              </w:rPr>
+              <w:t>دستگاه ولتاژ باتری را بی‌بار اندازه می‌گیرد. اگر زیر حدود ۲۵ ولت باشد، باتری را خالی می‌داند و بدون برق ورودی وصل نمی‌کند. برق ورودی را برگردانید تا باتری شارژ شود.</w:t>
+            </w:r>
+          </w:p>
+        </w:tc>
+      </w:tr>
+      <w:tr>
+        <w:tc>
+          <w:tcPr>
+            <w:tcW w:type="dxa" w:w="2948"/>
+          </w:tcPr>
+          <w:p>
+            <w:pPr>
+              <w:bidi w:val="1"/>
+              <w:spacing w:line="300" w:lineRule="auto"/>
+              <w:jc w:val="right"/>
+            </w:pPr>
+            <w:r/>
+            <w:r>
+              <w:rPr>
+                <w:rFonts w:ascii="Vazirmatn" w:hAnsi="Vazirmatn"/>
+                <w:b w:val="0"/>
+                <w:sz w:val="22"/>
+                <w:rFonts w:ascii="Vazirmatn" w:hAnsi="Vazirmatn" w:cs="Vazirmatn"/>
+                <w:rtl w:val="1"/>
+              </w:rPr>
               <w:t>پنل باز نمی‌شود</w:t>
             </w:r>
           </w:p>
@@ -3311,7 +3547,6 @@
         <w:tc>
           <w:tcPr>
             <w:tcW w:type="dxa" w:w="6123"/>
-            <w:shd w:val="clear" w:fill="F2F6FC"/>
           </w:tcPr>
           <w:p>
             <w:pPr>
@@ -3337,6 +3572,7 @@
         <w:tc>
           <w:tcPr>
             <w:tcW w:type="dxa" w:w="2948"/>
+            <w:shd w:val="clear" w:fill="F2F6FC"/>
           </w:tcPr>
           <w:p>
             <w:pPr>
@@ -3360,6 +3596,7 @@
         <w:tc>
           <w:tcPr>
             <w:tcW w:type="dxa" w:w="6123"/>
+            <w:shd w:val="clear" w:fill="F2F6FC"/>
           </w:tcPr>
           <w:p>
             <w:pPr>

</xml_diff>

<commit_message>
v1.107: doc audit - fix user manual vs code, refresh all stale documents
Co-authored-by: arena-agent <297053741+arena-agent@users.noreply.github.com>
</commit_message>
<xml_diff>
--- a/Documentation/User_Manual.docx
+++ b/Documentation/User_Manual.docx
@@ -277,7 +277,7 @@
           <w:rFonts w:ascii="Vazirmatn" w:hAnsi="Vazirmatn" w:cs="Vazirmatn"/>
           <w:rtl w:val="1"/>
         </w:rPr>
-        <w:t>برق ورودی مستقیم (DC) بین ۲۲ تا ۲۸ ولت.</w:t>
+        <w:t>برق ورودی مستقیم (DC) بین ۲۱ تا ۲۸ ولت.</w:t>
       </w:r>
     </w:p>
     <w:p>
@@ -1235,7 +1235,7 @@
                 <w:rFonts w:ascii="Vazirmatn" w:hAnsi="Vazirmatn" w:cs="Vazirmatn"/>
                 <w:rtl w:val="1"/>
               </w:rPr>
-              <w:t>طبیعی است؛ بعد از چند دقیقه خودش دوباره شارژ را شروع می‌کند.</w:t>
+              <w:t>طبیعی است؛ حدود ۱۰ دقیقه بعد خودش دوباره شارژ را شروع می‌کند.</w:t>
             </w:r>
           </w:p>
         </w:tc>
@@ -1873,7 +1873,7 @@
           <w:rFonts w:ascii="Vazirmatn" w:hAnsi="Vazirmatn" w:cs="Vazirmatn"/>
           <w:rtl w:val="1"/>
         </w:rPr>
-        <w:t>اگر همان یک بار امتحان هم جواب ندهد و بار دوباره داخل حدود یک دقیقه قطع شود، دستگاه می‌فهمد باتری فرسوده است: چراغ قرمز چشمک می‌زند و بوق می‌زند و مسیر باتری بسته می‌ماند. این چشمک و بوق فقط وقتی است که برق ورودی قطع باشد؛ به محض برگشتن برق ورودی، چراغ‌های شارژ برمی‌گردند و بار از برق ورودی کار می‌کند.</w:t>
+        <w:t>اگر همان یک بار امتحان هم جواب ندهد و بار دوباره داخل حدود یک دقیقه قطع شود، دستگاه می‌فهمد باتری فرسوده است: چراغ قرمز چشمک می‌زند و بوق می‌زند و مسیر باتری بسته می‌ماند. این چشمک و بوق فقط وقتی است که برق ورودی قطع باشد؛ با برگشتن برق ورودی، چراغ‌های شارژ برمی‌گردند و بار از برق ورودی کار می‌کند.</w:t>
       </w:r>
     </w:p>
     <w:p>
@@ -1890,7 +1890,7 @@
           <w:rFonts w:ascii="Vazirmatn" w:hAnsi="Vazirmatn" w:cs="Vazirmatn"/>
           <w:rtl w:val="1"/>
         </w:rPr>
-        <w:t>این هشدار باتری فرسوده خودش پاک می‌شود: اگر ولتاژ باتری ۱۰ دقیقه پشت سر هم بالای حدود ۲۱٫۲ ولت بماند، هشدار می‌رود و دستگاه یک بار دیگر می‌تواند باتری را امتحان کند. در پنل، کارت ۸ هم دکمهٔ «پاک‌کردن حکم» دارد که با آن می‌توانید همین حالا هشدار را پاک کنید.</w:t>
+        <w:t>این هشدار باتری فرسوده خودش پاک می‌شود: اگر ولتاژ باتری ۱۰ دقیقه پشت سر هم بالای حدود ۲۱٫۲ ولت بماند، هشدار می‌رود و دستگاه یک بار دیگر می‌تواند باتری را امتحان کند. اگر خواستید همین حالا هشدار را پاک کنید، در پنل کاربر به بخش تنظیمات بروید و «ریست قفل‌ها» را بزنید (فقط ادمین).</w:t>
       </w:r>
     </w:p>
     <w:p>
@@ -2396,7 +2396,7 @@
                 <w:rFonts w:ascii="Vazirmatn" w:hAnsi="Vazirmatn" w:cs="Vazirmatn"/>
                 <w:rtl w:val="1"/>
               </w:rPr>
-              <w:t>منبع برق ورودی را بررسی کنید و ولتاژ درست (۲۲ تا ۲۸ ولت) بدهید.</w:t>
+              <w:t>منبع برق ورودی را بررسی کنید و ولتاژ درست (۲۱ تا ۲۸ ولت) بدهید.</w:t>
             </w:r>
           </w:p>
         </w:tc>
@@ -2624,7 +2624,7 @@
           <w:rFonts w:ascii="Vazirmatn" w:hAnsi="Vazirmatn" w:cs="Vazirmatn"/>
           <w:rtl w:val="1"/>
         </w:rPr>
-        <w:t>یک باتری کهنه را می‌گذارید و یک شبانه‌روز (۲۴ ساعت) در شارژ می‌ماند ولی پر نمی‌شود. دستگاه می‌فهمد این باتری خراب است: چراغ قرمز ثابت می‌ماند و دیگر آن باتری را شارژ نمی‌کند. راهش عوض‌کردن باتری است.</w:t>
+        <w:t>یک باتری کهنه را می‌گذارید و یک شبانه‌روز (۲۴ ساعت) در شارژ می‌ماند ولی پر نمی‌شود. دستگاه می‌فهمد این باتری خراب است: چراغ قرمز ثابت می‌ماند و دیگر آن باتری را شارژ نمی‌کند. راهش عوض‌کردن باتری است. حکم «باتری خراب» با «ریست قفل‌ها» در تنظیمات پنل پاک می‌شود، ولی مشکل باتری با این کار حل نمی‌شود.</w:t>
       </w:r>
     </w:p>
     <w:p>
@@ -2848,7 +2848,7 @@
           <w:rFonts w:ascii="Vazirmatn" w:hAnsi="Vazirmatn" w:cs="Vazirmatn"/>
           <w:rtl w:val="1"/>
         </w:rPr>
-        <w:t>مرورگر را باز کنید و نشانی پنل را که روی همان برچسب است بنویسید.</w:t>
+        <w:t>مرورگر را باز کنید و نشانی پنل را که روی همان برچسب است بنویسید (معمولاً http://192.168.4.1).</w:t>
       </w:r>
     </w:p>
     <w:p>
@@ -3042,7 +3042,35 @@
           <w:rFonts w:ascii="Vazirmatn" w:hAnsi="Vazirmatn" w:cs="Vazirmatn"/>
           <w:rtl w:val="1"/>
         </w:rPr>
-        <w:t>دو دکمهٔ روشن و خاموش برای دو شارژر دارد. با خاموش‌کردن، شارژ آن باتری همان لحظه قطع می‌شود. برای کار عادی، هر دو را روشن نگه دارید.</w:t>
+        <w:t>درصد شارژ باتری را مثل موبایل نشان می‌دهد و هر نیم‌باتری شمارندهٔ شارژ خودش را دارد.</w:t>
+      </w:r>
+    </w:p>
+    <w:p>
+      <w:pPr>
+        <w:bidi w:val="1"/>
+        <w:spacing w:after="60" w:line="324" w:lineRule="auto"/>
+        <w:jc w:val="right"/>
+      </w:pPr>
+      <w:r>
+        <w:rPr>
+          <w:rFonts w:ascii="Vazirmatn" w:hAnsi="Vazirmatn"/>
+          <w:b/>
+          <w:color w:val="1F3864"/>
+          <w:sz w:val="24"/>
+          <w:rFonts w:ascii="Vazirmatn" w:hAnsi="Vazirmatn" w:cs="Vazirmatn"/>
+          <w:rtl w:val="1"/>
+        </w:rPr>
+        <w:t xml:space="preserve">•  </w:t>
+      </w:r>
+      <w:r>
+        <w:rPr>
+          <w:rFonts w:ascii="Vazirmatn" w:hAnsi="Vazirmatn"/>
+          <w:b w:val="0"/>
+          <w:sz w:val="24"/>
+          <w:rFonts w:ascii="Vazirmatn" w:hAnsi="Vazirmatn" w:cs="Vazirmatn"/>
+          <w:rtl w:val="1"/>
+        </w:rPr>
+        <w:t>تاریخچهٔ شارژ، آمار کار، قطع‌ووصل‌های آخر برق شهر و خطاهای آخر هم در پنل هست.</w:t>
       </w:r>
     </w:p>
     <w:p>
@@ -3124,7 +3152,7 @@
           <w:rFonts w:ascii="Vazirmatn" w:hAnsi="Vazirmatn" w:cs="Vazirmatn"/>
           <w:rtl w:val="1"/>
         </w:rPr>
-        <w:t>تنظیمات شارژ</w:t>
+        <w:t>تنظیمات و کارهای فنی</w:t>
       </w:r>
     </w:p>
     <w:p>
@@ -3152,7 +3180,7 @@
           <w:rFonts w:ascii="Vazirmatn" w:hAnsi="Vazirmatn" w:cs="Vazirmatn"/>
           <w:rtl w:val="1"/>
         </w:rPr>
-        <w:t>این صفحه برای نصاب و آدم فنی است. اگر لازم ندارید، چیزی را در آن عوض نکنید.</w:t>
+        <w:t>در بخش تنظیمات پنل کاربر می‌توانید تم روشن/تیره، نام و رمز وای‌فای، ساعت دستگاه و کاربران را مدیریت کنید، رمز عوض کنید، تاریخچه را پاک کنید و «ریست قفل‌ها» را بزنید (پاک‌کردن حکم «باتری خراب» و «باتری ضعیف» و قفل عدم‌توازن). بعضی از این کارها فقط برای ادمین است.</w:t>
       </w:r>
     </w:p>
     <w:p>
@@ -3180,7 +3208,7 @@
           <w:rFonts w:ascii="Vazirmatn" w:hAnsi="Vazirmatn" w:cs="Vazirmatn"/>
           <w:rtl w:val="1"/>
         </w:rPr>
-        <w:t>هر عددی که عوض کنید، خودش ذخیره می‌شود و با قطع برق از بین نمی‌رود.</w:t>
+        <w:t>«تاریخچهٔ وضعیت» همیشه در حال نوشتن است؛ حتی اگر لحظه‌ای ارتباط با برد قطع باشد، رویدادهای همان دوره ثبت می‌شود و بعداً می‌توانید ببینیدشان.</w:t>
       </w:r>
     </w:p>
     <w:p>
@@ -3208,7 +3236,7 @@
           <w:rFonts w:ascii="Vazirmatn" w:hAnsi="Vazirmatn" w:cs="Vazirmatn"/>
           <w:rtl w:val="1"/>
         </w:rPr>
-        <w:t>اگر چیزی را اشتباه عوض کردید، دکمهٔ «بازگردانی پیش‌فرض کارخانه» همه را به حالت اول برمی‌گرداند.</w:t>
+        <w:t>تنظیم اعداد شارژ، سناریوها، کالیبراسیون، روشن/خاموش کردن شارژرها و دیدن زندهٔ چراغ‌ها کار پنل فنی نصاب است و در پنل کاربر نیست. اگر لازم ندارید، چیزی را عوض نکنید.</w:t>
       </w:r>
     </w:p>
     <w:p>
@@ -3236,7 +3264,7 @@
           <w:rFonts w:ascii="Vazirmatn" w:hAnsi="Vazirmatn" w:cs="Vazirmatn"/>
           <w:rtl w:val="1"/>
         </w:rPr>
-        <w:t>در همین پنل می‌توانید چراغ‌های دستگاه را هم زنده ببینید.</w:t>
+        <w:t>هر عددی که در پنل فنی عوض شود، خودش ذخیره می‌شود و با قطع برق از بین نمی‌رود. اگر چیزی را اشتباه عوض کردید، دکمهٔ «بازگردانی پیش‌فرض کارخانه» همان بخش، همان‌ها را به حالت اول برمی‌گرداند.</w:t>
       </w:r>
     </w:p>
     <w:p>
@@ -3417,7 +3445,7 @@
                 <w:rFonts w:ascii="Vazirmatn" w:hAnsi="Vazirmatn" w:cs="Vazirmatn"/>
                 <w:rtl w:val="1"/>
               </w:rPr>
-              <w:t>برق ورودی بین ۲۲ تا ۲۸ ولت هست؟ (با ولت‌متر اندازه بگیرید؛ مثلاً ۲۴ ولت خوب است، ۱۹ ولت کم است.) در پنل، شارژر خاموش نشده باشد؟ سیم باتری شل نباشد؟</w:t>
+              <w:t>برق ورودی بین ۲۱ تا ۲۸ ولت هست؟ (با ولت‌متر اندازه بگیرید؛ مثلاً ۲۴ ولت خوب است، ۱۹ ولت کم است.) در پنل فنی، شارژر خاموش نشده باشد؟ سیم باتری شل نباشد؟</w:t>
             </w:r>
           </w:p>
         </w:tc>

</xml_diff>

<commit_message>
docs: audit STM32 + refresh all docs; remove charge CSV duration column (v1.117)
Co-authored-by: arena-agent <297053741+arena-agent@users.noreply.github.com>
</commit_message>
<xml_diff>
--- a/Documentation/User_Manual.docx
+++ b/Documentation/User_Manual.docx
@@ -1890,7 +1890,7 @@
           <w:rFonts w:ascii="Vazirmatn" w:hAnsi="Vazirmatn" w:cs="Vazirmatn"/>
           <w:rtl w:val="1"/>
         </w:rPr>
-        <w:t>این هشدار باتری فرسوده خودش پاک می‌شود: اگر ولتاژ باتری ۱۰ دقیقه پشت سر هم بالای حدود ۲۱٫۲ ولت بماند، هشدار می‌رود و دستگاه یک بار دیگر می‌تواند باتری را امتحان کند. اگر خواستید همین حالا هشدار را پاک کنید، در پنل کاربر به بخش تنظیمات بروید و «ریست قفل‌ها» را بزنید (فقط ادمین).</w:t>
+        <w:t>این هشدار باتری فرسوده خودش پاک می‌شود: اگر ولتاژ باتری ۱۰ دقیقه پشت سر هم بالای حدود ۲۱٫۲ ولت بماند، هشدار می‌رود؛ اما وصل بدون برق ورودی هنوز نیاز دارد باتری در استراحت به حدود ۲۵ ولت رسیده باشد. اگر خواستید همین حالا هشدار را پاک کنید، در پنل کاربر به بخش تنظیمات بروید و «ریست قفل‌ها» را بزنید (فقط ادمین).</w:t>
       </w:r>
     </w:p>
     <w:p>
@@ -2372,7 +2372,7 @@
                 <w:rFonts w:ascii="Vazirmatn" w:hAnsi="Vazirmatn" w:cs="Vazirmatn"/>
                 <w:rtl w:val="1"/>
               </w:rPr>
-              <w:t>ولتاژ برق ورودی خیلی بالا رفته است (بیشتر از ۲۸ ولت).</w:t>
+              <w:t>ولتاژ برق ورودی از سقف تنظیم‌شده بالاتر رفته است (پیش‌فرض ۲۸ ولت).</w:t>
             </w:r>
           </w:p>
         </w:tc>
@@ -2396,7 +2396,7 @@
                 <w:rFonts w:ascii="Vazirmatn" w:hAnsi="Vazirmatn" w:cs="Vazirmatn"/>
                 <w:rtl w:val="1"/>
               </w:rPr>
-              <w:t>منبع برق ورودی را بررسی کنید و ولتاژ درست (۲۱ تا ۲۸ ولت) بدهید.</w:t>
+              <w:t>منبع برق ورودی را بررسی کنید و ولتاژ را داخل پنجرهٔ تنظیم‌شده (پیش‌فرض ۲۱ تا ۲۸ ولت) بیاورید.</w:t>
             </w:r>
           </w:p>
         </w:tc>
@@ -2493,7 +2493,7 @@
                 <w:rFonts w:ascii="Vazirmatn" w:hAnsi="Vazirmatn" w:cs="Vazirmatn"/>
                 <w:rtl w:val="1"/>
               </w:rPr>
-              <w:t>زرد چشمک‌زن تند و سبز ثابت، مدت طولانی</w:t>
+              <w:t>زرد چشمک‌زن ۱ ثانیه‌ای (نیم‌روشن) و سبز ثابت، مدت طولانی</w:t>
             </w:r>
           </w:p>
         </w:tc>
@@ -2680,7 +2680,7 @@
           <w:rFonts w:ascii="Vazirmatn" w:hAnsi="Vazirmatn" w:cs="Vazirmatn"/>
           <w:rtl w:val="1"/>
         </w:rPr>
-        <w:t>اشتباهی به جای ۲۴ ولت، ۳۰ ولت به ورودی می‌دهید. چون از ۲۸ ولت بیشتر است، دستگاه خطای ولتاژ بالا می‌دهد و شارژ نمی‌کند تا ولتاژ درست شود.</w:t>
+        <w:t>اشتباهی به جای ۲۴ ولت، ۳۰ ولت به ورودی می‌دهید. چون از سقف پیش‌فرض ۲۸ ولت بیشتر است، دستگاه خطای ولتاژ بالا می‌دهد و شارژ نمی‌کند تا ولتاژ درست شود.</w:t>
       </w:r>
     </w:p>
     <w:p>
@@ -2708,7 +2708,7 @@
           <w:rFonts w:ascii="Vazirmatn" w:hAnsi="Vazirmatn" w:cs="Vazirmatn"/>
           <w:rtl w:val="1"/>
         </w:rPr>
-        <w:t>باتری یک ساعت تند شارژ شده و گرم شده است. دستگاه ۱۰ دقیقه استراحت می‌کند (زرد تند چشمک می‌زند) و بعد خودش شارژ را ادامه می‌دهد. این خطا نیست.</w:t>
+        <w:t>باتری یک ساعت تند شارژ شده و گرم شده است. دستگاه ۱۰ دقیقه استراحت می‌کند (زرد با دورهٔ ۱ ثانیه چشمک می‌زند) و بعد خودش شارژ را ادامه می‌دهد. این خطا نیست.</w:t>
       </w:r>
     </w:p>
     <w:p>

</xml_diff>